<commit_message>
Updated my CV in docx
</commit_message>
<xml_diff>
--- a/RolinAzmitia-CV.docx
+++ b/RolinAzmitia-CV.docx
@@ -19,6 +19,15 @@
           <w:szCs w:val="36"/>
         </w:rPr>
         <w:t>ROLIN AZMITIA</w:t>
+      </w:r>
+      <w:r>
+        <w:rPr>
+          <w:b/>
+          <w:bCs/>
+          <w:sz w:val="36"/>
+          <w:szCs w:val="36"/>
+        </w:rPr>
+        <w:t xml:space="preserve"> | M365 Administrator</w:t>
       </w:r>
     </w:p>
     <w:p>
@@ -80,49 +89,14 @@
     <w:p>
       <w:pPr>
         <w:pStyle w:val="Heading1"/>
-        <w:rPr>
-          <w:lang w:val="es-ES"/>
-        </w:rPr>
-      </w:pPr>
-      <w:r>
-        <w:rPr>
-          <w:lang w:val="es-ES"/>
-        </w:rPr>
+      </w:pPr>
+      <w:r>
         <w:t>PROFESSIONAL SUMMARY</w:t>
       </w:r>
     </w:p>
     <w:p>
       <w:r>
-        <w:t xml:space="preserve">Highly resourceful and approachable M365 Administrator with over 3 years of providing IT support to Enterprise users. Strong advocate of standardization and automation to make mine and my users’ lives easier in the </w:t>
-      </w:r>
-      <w:r>
-        <w:t>long run</w:t>
-      </w:r>
-      <w:r>
-        <w:t xml:space="preserve">. </w:t>
-      </w:r>
-    </w:p>
-    <w:p>
-      <w:r>
-        <w:t>I p</w:t>
-      </w:r>
-      <w:r>
-        <w:t>rovide tier-</w:t>
-      </w:r>
-      <w:r>
-        <w:t>3</w:t>
-      </w:r>
-      <w:r>
-        <w:t xml:space="preserve"> SharePoint support</w:t>
-      </w:r>
-      <w:r>
-        <w:t xml:space="preserve"> for a company of over 20,000 people</w:t>
-      </w:r>
-      <w:r>
-        <w:t>,</w:t>
-      </w:r>
-      <w:r>
-        <w:t xml:space="preserve"> resolving complex permissions, access requests, and technical issues for internal and external users across a cross-departmental environment. Troubleshoot OneDrive integration with SharePoint Sync, Office 365, Active Directory, Azure Entra ID, and Power Platform. Utilize PowerShell automation for bulk operations and custom solutions. Deliver excellent customer service while documenting solutions and improving processes.</w:t>
+        <w:t>Highly resourceful M365 Administrator with 3+ years providing IT support to enterprise users in a 20,000+ person organization. Strong advocate for automation and standardization to improve efficiency. Currently provide tier-2/3 SharePoint support, resolving complex permissions, access requests, and technical issues across cross-departmental environments. Utilize PowerShell automation, PnP scripting, and Power Platform for custom solutions while delivering excellent customer service and process improvements.</w:t>
       </w:r>
     </w:p>
     <w:p>
@@ -130,9 +104,6 @@
         <w:pStyle w:val="Heading1"/>
       </w:pPr>
       <w:r>
-        <w:rPr>
-          <w:lang w:val="es-ES"/>
-        </w:rPr>
         <w:t>CORE COMPETENCIES</w:t>
       </w:r>
     </w:p>
@@ -158,6 +129,18 @@
         <w:t>•</w:t>
       </w:r>
       <w:r>
+        <w:rPr>
+          <w:sz w:val="24"/>
+        </w:rPr>
+        <w:t xml:space="preserve"> PnP PowerShell </w:t>
+      </w:r>
+      <w:r>
+        <w:rPr>
+          <w:sz w:val="24"/>
+        </w:rPr>
+        <w:t>•</w:t>
+      </w:r>
+      <w:r>
         <w:t xml:space="preserve"> Microsoft Teams </w:t>
       </w:r>
       <w:r>
@@ -167,7 +150,19 @@
         <w:t>•</w:t>
       </w:r>
       <w:r>
-        <w:t xml:space="preserve"> Entra ID (Azure AD) </w:t>
+        <w:t xml:space="preserve"> Entra ID (Azure A</w:t>
+      </w:r>
+      <w:r>
+        <w:t xml:space="preserve">ctive </w:t>
+      </w:r>
+      <w:r>
+        <w:t>D</w:t>
+      </w:r>
+      <w:r>
+        <w:t>irectory</w:t>
+      </w:r>
+      <w:r>
+        <w:t xml:space="preserve">) </w:t>
       </w:r>
       <w:r>
         <w:rPr>
@@ -208,6 +203,15 @@
       <w:r>
         <w:t xml:space="preserve"> Permissions management</w:t>
       </w:r>
+      <w:r>
+        <w:t xml:space="preserve"> </w:t>
+      </w:r>
+      <w:r>
+        <w:t>•</w:t>
+      </w:r>
+      <w:r>
+        <w:t xml:space="preserve"> Power Platform (Power Apps, Power Automate, Power BI)</w:t>
+      </w:r>
     </w:p>
     <w:p/>
     <w:p>
@@ -244,7 +248,13 @@
         <w:t>•</w:t>
       </w:r>
       <w:r>
-        <w:t xml:space="preserve"> CI/CD pipeline </w:t>
+        <w:t xml:space="preserve"> CI/CD pipeline</w:t>
+      </w:r>
+      <w:r>
+        <w:t>s</w:t>
+      </w:r>
+      <w:r>
+        <w:t xml:space="preserve"> </w:t>
       </w:r>
       <w:r>
         <w:t>•</w:t>
@@ -258,6 +268,21 @@
       <w:r>
         <w:t xml:space="preserve"> YAML</w:t>
       </w:r>
+      <w:r>
+        <w:t xml:space="preserve"> </w:t>
+      </w:r>
+      <w:r>
+        <w:rPr>
+          <w:sz w:val="24"/>
+        </w:rPr>
+        <w:t>•</w:t>
+      </w:r>
+      <w:r>
+        <w:rPr>
+          <w:sz w:val="24"/>
+        </w:rPr>
+        <w:t xml:space="preserve"> DevSecOps</w:t>
+      </w:r>
     </w:p>
     <w:p/>
     <w:p>
@@ -285,9 +310,33 @@
         <w:t xml:space="preserve">Information governance </w:t>
       </w:r>
       <w:r>
+        <w:rPr>
+          <w:sz w:val="24"/>
+        </w:rPr>
         <w:t>•</w:t>
       </w:r>
       <w:r>
+        <w:t xml:space="preserve"> </w:t>
+      </w:r>
+      <w:r>
+        <w:t xml:space="preserve">Process improvement </w:t>
+      </w:r>
+      <w:r>
+        <w:rPr>
+          <w:sz w:val="24"/>
+        </w:rPr>
+        <w:t>•</w:t>
+      </w:r>
+      <w:r>
+        <w:t xml:space="preserve"> </w:t>
+      </w:r>
+      <w:r>
+        <w:t xml:space="preserve">Customer service </w:t>
+      </w:r>
+      <w:r>
+        <w:t>•</w:t>
+      </w:r>
+      <w:r>
         <w:t xml:space="preserve"> Active Directory </w:t>
       </w:r>
       <w:r>
@@ -307,6 +356,27 @@
       </w:r>
       <w:r>
         <w:t xml:space="preserve"> Git version control </w:t>
+      </w:r>
+      <w:r>
+        <w:t>•</w:t>
+      </w:r>
+      <w:r>
+        <w:t xml:space="preserve"> Sharegate </w:t>
+      </w:r>
+      <w:r>
+        <w:t>•</w:t>
+      </w:r>
+      <w:r>
+        <w:t xml:space="preserve"> Site migrations</w:t>
+      </w:r>
+      <w:r>
+        <w:t xml:space="preserve"> </w:t>
+      </w:r>
+      <w:r>
+        <w:t>•</w:t>
+      </w:r>
+      <w:r>
+        <w:t xml:space="preserve"> Backup/Recovery of data</w:t>
       </w:r>
     </w:p>
     <w:p>
@@ -351,11 +421,17 @@
         <w:pStyle w:val="ListParagraph"/>
         <w:numPr>
           <w:ilvl w:val="0"/>
-          <w:numId w:val="1"/>
+          <w:numId w:val="2"/>
         </w:numPr>
       </w:pPr>
       <w:r>
-        <w:t>I resolve permissions and access requests for internal and external users for SharePoint sites and pages.</w:t>
+        <w:t>I resolve permissions and access requests for</w:t>
+      </w:r>
+      <w:r>
+        <w:t xml:space="preserve"> 20,000+</w:t>
+      </w:r>
+      <w:r>
+        <w:t xml:space="preserve"> internal and external users for SharePoint sites and pages.</w:t>
       </w:r>
     </w:p>
     <w:p>
@@ -363,7 +439,7 @@
         <w:pStyle w:val="ListParagraph"/>
         <w:numPr>
           <w:ilvl w:val="0"/>
-          <w:numId w:val="1"/>
+          <w:numId w:val="2"/>
         </w:numPr>
       </w:pPr>
       <w:r>
@@ -375,7 +451,7 @@
         <w:pStyle w:val="ListParagraph"/>
         <w:numPr>
           <w:ilvl w:val="0"/>
-          <w:numId w:val="1"/>
+          <w:numId w:val="2"/>
         </w:numPr>
       </w:pPr>
       <w:r>
@@ -387,7 +463,7 @@
         <w:pStyle w:val="ListParagraph"/>
         <w:numPr>
           <w:ilvl w:val="0"/>
-          <w:numId w:val="1"/>
+          <w:numId w:val="2"/>
         </w:numPr>
       </w:pPr>
       <w:r>
@@ -399,11 +475,29 @@
         <w:pStyle w:val="ListParagraph"/>
         <w:numPr>
           <w:ilvl w:val="0"/>
-          <w:numId w:val="1"/>
+          <w:numId w:val="2"/>
         </w:numPr>
       </w:pPr>
       <w:r>
-        <w:t>Perform site migrations using Sharegate. Sites vary in size and complexity, ranging from just a couple of folders and libraries to huge sites with dozens of libraries and subsites.</w:t>
+        <w:t>Perform site migrations using Sharegate</w:t>
+      </w:r>
+      <w:r>
+        <w:t>, including content migration, permission mapping, and metadata preservation for</w:t>
+      </w:r>
+      <w:r>
+        <w:t xml:space="preserve"> </w:t>
+      </w:r>
+      <w:r>
+        <w:t>s</w:t>
+      </w:r>
+      <w:r>
+        <w:t>ites vary</w:t>
+      </w:r>
+      <w:r>
+        <w:t>ing</w:t>
+      </w:r>
+      <w:r>
+        <w:t xml:space="preserve"> in size and complexity, ranging from just a couple of folders and libraries to huge sites with dozens of libraries and subsites.</w:t>
       </w:r>
     </w:p>
     <w:p>
@@ -411,7 +505,7 @@
         <w:pStyle w:val="ListParagraph"/>
         <w:numPr>
           <w:ilvl w:val="0"/>
-          <w:numId w:val="1"/>
+          <w:numId w:val="2"/>
         </w:numPr>
       </w:pPr>
       <w:r>
@@ -457,7 +551,7 @@
         <w:pStyle w:val="ListParagraph"/>
         <w:numPr>
           <w:ilvl w:val="0"/>
-          <w:numId w:val="1"/>
+          <w:numId w:val="4"/>
         </w:numPr>
       </w:pPr>
       <w:r>
@@ -472,7 +566,7 @@
         <w:pStyle w:val="ListParagraph"/>
         <w:numPr>
           <w:ilvl w:val="0"/>
-          <w:numId w:val="1"/>
+          <w:numId w:val="4"/>
         </w:numPr>
       </w:pPr>
       <w:r>
@@ -484,11 +578,17 @@
         <w:pStyle w:val="ListParagraph"/>
         <w:numPr>
           <w:ilvl w:val="0"/>
-          <w:numId w:val="1"/>
+          <w:numId w:val="4"/>
         </w:numPr>
       </w:pPr>
       <w:r>
-        <w:t>Assisted local and international users who were having issues with O365, Active Directory, BitLocker, network connectivity, printers, and general Windows performance issues.</w:t>
+        <w:t>Assisted local and international users who were having issues with O</w:t>
+      </w:r>
+      <w:r>
+        <w:t xml:space="preserve">ffice </w:t>
+      </w:r>
+      <w:r>
+        <w:t>365, Active Directory, BitLocker, network connectivity, printers, and general Windows performance issues.</w:t>
       </w:r>
     </w:p>
     <w:p>
@@ -496,7 +596,7 @@
         <w:pStyle w:val="ListParagraph"/>
         <w:numPr>
           <w:ilvl w:val="0"/>
-          <w:numId w:val="1"/>
+          <w:numId w:val="4"/>
         </w:numPr>
       </w:pPr>
       <w:r>
@@ -537,7 +637,7 @@
         <w:pStyle w:val="ListParagraph"/>
         <w:numPr>
           <w:ilvl w:val="0"/>
-          <w:numId w:val="1"/>
+          <w:numId w:val="5"/>
         </w:numPr>
       </w:pPr>
       <w:r>
@@ -573,7 +673,10 @@
     </w:p>
     <w:p>
       <w:r>
-        <w:t>Built a complete CI/CD pipeline using GitHub Actions, Python, and YAML to automatically sanitize and publish PowerShell scripts to a public portfolio repository. Pipeline includes pattern-based sanitization of sensitive data (credentials, company identifiers, internal URLs), intelligent script categorization, cross-repository automation, and comprehensive audit logging. Demonstrates DevSecOps best practices: secrets management, automated workflows, and separation of concerns.</w:t>
+        <w:t xml:space="preserve">Designed and implemented a </w:t>
+      </w:r>
+      <w:r>
+        <w:t>complete CI/CD pipeline using GitHub Actions, Python, and YAML to automatically sanitize and publish PowerShell scripts to a public portfolio repository. Pipeline includes pattern-based sanitization of sensitive data (credentials, company identifiers, internal URLs), intelligent script categorization, cross-repository automation, and comprehensive audit logging. Demonstrates DevSecOps best practices: secrets management, automated workflows, and separation of concerns.</w:t>
       </w:r>
     </w:p>
     <w:p>
@@ -601,7 +704,10 @@
     </w:p>
     <w:p>
       <w:r>
-        <w:t>Quantifiable impact, reducing days of manual verification down to hours of automated migration.</w:t>
+        <w:t>Quantifiable impact, reducing days of manual verification down to hours of automated migration</w:t>
+      </w:r>
+      <w:r>
+        <w:t xml:space="preserve"> - 15+ hours reduced to 1 and a half.</w:t>
       </w:r>
     </w:p>
     <w:p>
@@ -652,7 +758,6 @@
           <w:bCs/>
         </w:rPr>
       </w:pPr>
-      <w:proofErr w:type="gramStart"/>
       <w:r>
         <w:rPr>
           <w:b/>
@@ -660,7 +765,6 @@
         </w:rPr>
         <w:t>Bachelor's in Computer Science</w:t>
       </w:r>
-      <w:proofErr w:type="gramEnd"/>
       <w:r>
         <w:rPr>
           <w:b/>
@@ -716,6 +820,7 @@
           <w:b/>
           <w:bCs/>
         </w:rPr>
+        <w:lastRenderedPageBreak/>
         <w:t>CompTIA A+</w:t>
       </w:r>
       <w:r>
@@ -860,8 +965,7 @@
               <v:stroke joinstyle="miter"/>
               <v:path gradientshapeok="t" o:connecttype="rect"/>
             </v:shapetype>
-            <v:shape id="Text Box 2" o:spid="_x0000_s1026" type="#_x0000_t202" alt="Internal Only" style="position:absolute;margin-left:0;margin-top:0;width:52.7pt;height:29.15pt;z-index:251659264;visibility:visible;mso-wrap-style:none;mso-wrap-distance-left:0;mso-wrap-distance-top:0;mso-wrap-distance-right:0;mso-wrap-distance-bottom:0;mso-position-horizontal:center;mso-position-horizontal-relative:page;mso-position-vertical:bottom;mso-position-vertical-relative:page;v-text-anchor:bottom" o:gfxdata="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" filled="f" stroked="f">
-              <v:fill o:detectmouseclick="t"/>
+            <v:shape id="Text Box 2" o:spid="_x0000_s1026" type="#_x0000_t202" alt="Internal Only" style="position:absolute;margin-left:0;margin-top:0;width:52.7pt;height:29.15pt;z-index:251659264;visibility:visible;mso-wrap-style:none;mso-wrap-distance-left:0;mso-wrap-distance-top:0;mso-wrap-distance-right:0;mso-wrap-distance-bottom:0;mso-position-horizontal:center;mso-position-horizontal-relative:page;mso-position-vertical:bottom;mso-position-vertical-relative:page;v-text-anchor:bottom" o:gfxdata="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" filled="f" stroked="f">
               <v:textbox style="mso-fit-shape-to-text:t" inset="0,0,0,15pt">
                 <w:txbxContent>
                   <w:p>
@@ -991,8 +1095,7 @@
               <v:stroke joinstyle="miter"/>
               <v:path gradientshapeok="t" o:connecttype="rect"/>
             </v:shapetype>
-            <v:shape id="Text Box 3" o:spid="_x0000_s1027" type="#_x0000_t202" alt="Internal Only" style="position:absolute;margin-left:0;margin-top:0;width:52.7pt;height:29.15pt;z-index:251660288;visibility:visible;mso-wrap-style:none;mso-wrap-distance-left:0;mso-wrap-distance-top:0;mso-wrap-distance-right:0;mso-wrap-distance-bottom:0;mso-position-horizontal:center;mso-position-horizontal-relative:page;mso-position-vertical:bottom;mso-position-vertical-relative:page;v-text-anchor:bottom" o:gfxdata="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" filled="f" stroked="f">
-              <v:fill o:detectmouseclick="t"/>
+            <v:shape id="Text Box 3" o:spid="_x0000_s1027" type="#_x0000_t202" alt="Internal Only" style="position:absolute;margin-left:0;margin-top:0;width:52.7pt;height:29.15pt;z-index:251660288;visibility:visible;mso-wrap-style:none;mso-wrap-distance-left:0;mso-wrap-distance-top:0;mso-wrap-distance-right:0;mso-wrap-distance-bottom:0;mso-position-horizontal:center;mso-position-horizontal-relative:page;mso-position-vertical:bottom;mso-position-vertical-relative:page;v-text-anchor:bottom" o:gfxdata="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" filled="f" stroked="f">
               <v:textbox style="mso-fit-shape-to-text:t" inset="0,0,0,15pt">
                 <w:txbxContent>
                   <w:p>
@@ -1122,8 +1225,7 @@
               <v:stroke joinstyle="miter"/>
               <v:path gradientshapeok="t" o:connecttype="rect"/>
             </v:shapetype>
-            <v:shape id="Text Box 1" o:spid="_x0000_s1028" type="#_x0000_t202" alt="Internal Only" style="position:absolute;margin-left:0;margin-top:0;width:52.7pt;height:29.15pt;z-index:251658240;visibility:visible;mso-wrap-style:none;mso-wrap-distance-left:0;mso-wrap-distance-top:0;mso-wrap-distance-right:0;mso-wrap-distance-bottom:0;mso-position-horizontal:center;mso-position-horizontal-relative:page;mso-position-vertical:bottom;mso-position-vertical-relative:page;v-text-anchor:bottom" o:gfxdata="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" filled="f" stroked="f">
-              <v:fill o:detectmouseclick="t"/>
+            <v:shape id="Text Box 1" o:spid="_x0000_s1028" type="#_x0000_t202" alt="Internal Only" style="position:absolute;margin-left:0;margin-top:0;width:52.7pt;height:29.15pt;z-index:251658240;visibility:visible;mso-wrap-style:none;mso-wrap-distance-left:0;mso-wrap-distance-top:0;mso-wrap-distance-right:0;mso-wrap-distance-bottom:0;mso-position-horizontal:center;mso-position-horizontal-relative:page;mso-position-vertical:bottom;mso-position-vertical-relative:page;v-text-anchor:bottom" o:gfxdata="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" filled="f" stroked="f">
               <v:textbox style="mso-fit-shape-to-text:t" inset="0,0,0,15pt">
                 <w:txbxContent>
                   <w:p>
@@ -1188,6 +1290,119 @@
 <file path=word/numbering.xml><?xml version="1.0" encoding="utf-8"?>
 <w:numbering xmlns:wpc="http://schemas.microsoft.com/office/word/2010/wordprocessingCanvas" xmlns:cx="http://schemas.microsoft.com/office/drawing/2014/chartex" xmlns:cx1="http://schemas.microsoft.com/office/drawing/2015/9/8/chartex" xmlns:cx2="http://schemas.microsoft.com/office/drawing/2015/10/21/chartex" xmlns:cx3="http://schemas.microsoft.com/office/drawing/2016/5/9/chartex" xmlns:cx4="http://schemas.microsoft.com/office/drawing/2016/5/10/chartex" xmlns:cx5="http://schemas.microsoft.com/office/drawing/2016/5/11/chartex" xmlns:cx6="http://schemas.microsoft.com/office/drawing/2016/5/12/chartex" xmlns:cx7="http://schemas.microsoft.com/office/drawing/2016/5/13/chartex" xmlns:cx8="http://schemas.microsoft.com/office/drawing/2016/5/14/chartex" xmlns:mc="http://schemas.openxmlformats.org/markup-compatibility/2006" xmlns:aink="http://schemas.microsoft.com/office/drawing/2016/ink" xmlns:am3d="http://schemas.microsoft.com/office/drawing/2017/model3d" xmlns:o="urn:schemas-microsoft-com:office:office" xmlns:oel="http://schemas.microsoft.com/office/2019/extlst" xmlns:r="http://schemas.openxmlformats.org/officeDocument/2006/relationships" xmlns:m="http://schemas.openxmlformats.org/officeDocument/2006/math" xmlns:v="urn:schemas-microsoft-com:vml" xmlns:wp14="http://schemas.microsoft.com/office/word/2010/wordprocessingDrawing" xmlns:wp="http://schemas.openxmlformats.org/drawingml/2006/wordprocessingDrawing" xmlns:w10="urn:schemas-microsoft-com:office:word" xmlns:w="http://schemas.openxmlformats.org/wordprocessingml/2006/main" xmlns:w14="http://schemas.microsoft.com/office/word/2010/wordml" xmlns:w15="http://schemas.microsoft.com/office/word/2012/wordml" xmlns:w16cex="http://schemas.microsoft.com/office/word/2018/wordml/cex" xmlns:w16cid="http://schemas.microsoft.com/office/word/2016/wordml/cid" xmlns:w16="http://schemas.microsoft.com/office/word/2018/wordml" xmlns:w16du="http://schemas.microsoft.com/office/word/2023/wordml/word16du" xmlns:w16sdtdh="http://schemas.microsoft.com/office/word/2020/wordml/sdtdatahash" xmlns:w16sdtfl="http://schemas.microsoft.com/office/word/2024/wordml/sdtformatlock" xmlns:w16se="http://schemas.microsoft.com/office/word/2015/wordml/symex" xmlns:wpg="http://schemas.microsoft.com/office/word/2010/wordprocessingGroup" xmlns:wpi="http://schemas.microsoft.com/office/word/2010/wordprocessingInk" xmlns:wne="http://schemas.microsoft.com/office/word/2006/wordml" xmlns:wps="http://schemas.microsoft.com/office/word/2010/wordprocessingShape" mc:Ignorable="w14 w15 w16se w16cid w16 w16cex w16sdtdh w16sdtfl w16du wp14">
   <w:abstractNum w:abstractNumId="0" w15:restartNumberingAfterBreak="0">
+    <w:nsid w:val="3261005E"/>
+    <w:multiLevelType w:val="hybridMultilevel"/>
+    <w:tmpl w:val="3C96AC60"/>
+    <w:lvl w:ilvl="0" w:tplc="B9E2A2F6">
+      <w:numFmt w:val="bullet"/>
+      <w:lvlText w:val="•"/>
+      <w:lvlJc w:val="left"/>
+      <w:pPr>
+        <w:ind w:left="720" w:hanging="360"/>
+      </w:pPr>
+      <w:rPr>
+        <w:rFonts w:ascii="Arial" w:eastAsiaTheme="minorHAnsi" w:hAnsi="Arial" w:cs="Arial" w:hint="default"/>
+        <w:sz w:val="24"/>
+      </w:rPr>
+    </w:lvl>
+    <w:lvl w:ilvl="1" w:tplc="04090003" w:tentative="1">
+      <w:start w:val="1"/>
+      <w:numFmt w:val="bullet"/>
+      <w:lvlText w:val="o"/>
+      <w:lvlJc w:val="left"/>
+      <w:pPr>
+        <w:ind w:left="1440" w:hanging="360"/>
+      </w:pPr>
+      <w:rPr>
+        <w:rFonts w:ascii="Courier New" w:hAnsi="Courier New" w:cs="Courier New" w:hint="default"/>
+      </w:rPr>
+    </w:lvl>
+    <w:lvl w:ilvl="2" w:tplc="04090005" w:tentative="1">
+      <w:start w:val="1"/>
+      <w:numFmt w:val="bullet"/>
+      <w:lvlText w:val=""/>
+      <w:lvlJc w:val="left"/>
+      <w:pPr>
+        <w:ind w:left="2160" w:hanging="360"/>
+      </w:pPr>
+      <w:rPr>
+        <w:rFonts w:ascii="Wingdings" w:hAnsi="Wingdings" w:hint="default"/>
+      </w:rPr>
+    </w:lvl>
+    <w:lvl w:ilvl="3" w:tplc="04090001" w:tentative="1">
+      <w:start w:val="1"/>
+      <w:numFmt w:val="bullet"/>
+      <w:lvlText w:val=""/>
+      <w:lvlJc w:val="left"/>
+      <w:pPr>
+        <w:ind w:left="2880" w:hanging="360"/>
+      </w:pPr>
+      <w:rPr>
+        <w:rFonts w:ascii="Symbol" w:hAnsi="Symbol" w:hint="default"/>
+      </w:rPr>
+    </w:lvl>
+    <w:lvl w:ilvl="4" w:tplc="04090003" w:tentative="1">
+      <w:start w:val="1"/>
+      <w:numFmt w:val="bullet"/>
+      <w:lvlText w:val="o"/>
+      <w:lvlJc w:val="left"/>
+      <w:pPr>
+        <w:ind w:left="3600" w:hanging="360"/>
+      </w:pPr>
+      <w:rPr>
+        <w:rFonts w:ascii="Courier New" w:hAnsi="Courier New" w:cs="Courier New" w:hint="default"/>
+      </w:rPr>
+    </w:lvl>
+    <w:lvl w:ilvl="5" w:tplc="04090005" w:tentative="1">
+      <w:start w:val="1"/>
+      <w:numFmt w:val="bullet"/>
+      <w:lvlText w:val=""/>
+      <w:lvlJc w:val="left"/>
+      <w:pPr>
+        <w:ind w:left="4320" w:hanging="360"/>
+      </w:pPr>
+      <w:rPr>
+        <w:rFonts w:ascii="Wingdings" w:hAnsi="Wingdings" w:hint="default"/>
+      </w:rPr>
+    </w:lvl>
+    <w:lvl w:ilvl="6" w:tplc="04090001" w:tentative="1">
+      <w:start w:val="1"/>
+      <w:numFmt w:val="bullet"/>
+      <w:lvlText w:val=""/>
+      <w:lvlJc w:val="left"/>
+      <w:pPr>
+        <w:ind w:left="5040" w:hanging="360"/>
+      </w:pPr>
+      <w:rPr>
+        <w:rFonts w:ascii="Symbol" w:hAnsi="Symbol" w:hint="default"/>
+      </w:rPr>
+    </w:lvl>
+    <w:lvl w:ilvl="7" w:tplc="04090003" w:tentative="1">
+      <w:start w:val="1"/>
+      <w:numFmt w:val="bullet"/>
+      <w:lvlText w:val="o"/>
+      <w:lvlJc w:val="left"/>
+      <w:pPr>
+        <w:ind w:left="5760" w:hanging="360"/>
+      </w:pPr>
+      <w:rPr>
+        <w:rFonts w:ascii="Courier New" w:hAnsi="Courier New" w:cs="Courier New" w:hint="default"/>
+      </w:rPr>
+    </w:lvl>
+    <w:lvl w:ilvl="8" w:tplc="04090005" w:tentative="1">
+      <w:start w:val="1"/>
+      <w:numFmt w:val="bullet"/>
+      <w:lvlText w:val=""/>
+      <w:lvlJc w:val="left"/>
+      <w:pPr>
+        <w:ind w:left="6480" w:hanging="360"/>
+      </w:pPr>
+      <w:rPr>
+        <w:rFonts w:ascii="Wingdings" w:hAnsi="Wingdings" w:hint="default"/>
+      </w:rPr>
+    </w:lvl>
+  </w:abstractNum>
+  <w:abstractNum w:abstractNumId="1" w15:restartNumberingAfterBreak="0">
     <w:nsid w:val="4A794113"/>
     <w:multiLevelType w:val="hybridMultilevel"/>
     <w:tmpl w:val="D8EE9B5A"/>
@@ -1299,8 +1514,359 @@
       </w:rPr>
     </w:lvl>
   </w:abstractNum>
+  <w:abstractNum w:abstractNumId="2" w15:restartNumberingAfterBreak="0">
+    <w:nsid w:val="5CB26BE1"/>
+    <w:multiLevelType w:val="hybridMultilevel"/>
+    <w:tmpl w:val="D024B606"/>
+    <w:lvl w:ilvl="0" w:tplc="04090001">
+      <w:start w:val="1"/>
+      <w:numFmt w:val="bullet"/>
+      <w:lvlText w:val=""/>
+      <w:lvlJc w:val="left"/>
+      <w:pPr>
+        <w:ind w:left="1080" w:hanging="360"/>
+      </w:pPr>
+      <w:rPr>
+        <w:rFonts w:ascii="Symbol" w:hAnsi="Symbol" w:hint="default"/>
+      </w:rPr>
+    </w:lvl>
+    <w:lvl w:ilvl="1" w:tplc="04090003" w:tentative="1">
+      <w:start w:val="1"/>
+      <w:numFmt w:val="bullet"/>
+      <w:lvlText w:val="o"/>
+      <w:lvlJc w:val="left"/>
+      <w:pPr>
+        <w:ind w:left="1800" w:hanging="360"/>
+      </w:pPr>
+      <w:rPr>
+        <w:rFonts w:ascii="Courier New" w:hAnsi="Courier New" w:cs="Courier New" w:hint="default"/>
+      </w:rPr>
+    </w:lvl>
+    <w:lvl w:ilvl="2" w:tplc="04090005" w:tentative="1">
+      <w:start w:val="1"/>
+      <w:numFmt w:val="bullet"/>
+      <w:lvlText w:val=""/>
+      <w:lvlJc w:val="left"/>
+      <w:pPr>
+        <w:ind w:left="2520" w:hanging="360"/>
+      </w:pPr>
+      <w:rPr>
+        <w:rFonts w:ascii="Wingdings" w:hAnsi="Wingdings" w:hint="default"/>
+      </w:rPr>
+    </w:lvl>
+    <w:lvl w:ilvl="3" w:tplc="04090001" w:tentative="1">
+      <w:start w:val="1"/>
+      <w:numFmt w:val="bullet"/>
+      <w:lvlText w:val=""/>
+      <w:lvlJc w:val="left"/>
+      <w:pPr>
+        <w:ind w:left="3240" w:hanging="360"/>
+      </w:pPr>
+      <w:rPr>
+        <w:rFonts w:ascii="Symbol" w:hAnsi="Symbol" w:hint="default"/>
+      </w:rPr>
+    </w:lvl>
+    <w:lvl w:ilvl="4" w:tplc="04090003" w:tentative="1">
+      <w:start w:val="1"/>
+      <w:numFmt w:val="bullet"/>
+      <w:lvlText w:val="o"/>
+      <w:lvlJc w:val="left"/>
+      <w:pPr>
+        <w:ind w:left="3960" w:hanging="360"/>
+      </w:pPr>
+      <w:rPr>
+        <w:rFonts w:ascii="Courier New" w:hAnsi="Courier New" w:cs="Courier New" w:hint="default"/>
+      </w:rPr>
+    </w:lvl>
+    <w:lvl w:ilvl="5" w:tplc="04090005" w:tentative="1">
+      <w:start w:val="1"/>
+      <w:numFmt w:val="bullet"/>
+      <w:lvlText w:val=""/>
+      <w:lvlJc w:val="left"/>
+      <w:pPr>
+        <w:ind w:left="4680" w:hanging="360"/>
+      </w:pPr>
+      <w:rPr>
+        <w:rFonts w:ascii="Wingdings" w:hAnsi="Wingdings" w:hint="default"/>
+      </w:rPr>
+    </w:lvl>
+    <w:lvl w:ilvl="6" w:tplc="04090001" w:tentative="1">
+      <w:start w:val="1"/>
+      <w:numFmt w:val="bullet"/>
+      <w:lvlText w:val=""/>
+      <w:lvlJc w:val="left"/>
+      <w:pPr>
+        <w:ind w:left="5400" w:hanging="360"/>
+      </w:pPr>
+      <w:rPr>
+        <w:rFonts w:ascii="Symbol" w:hAnsi="Symbol" w:hint="default"/>
+      </w:rPr>
+    </w:lvl>
+    <w:lvl w:ilvl="7" w:tplc="04090003" w:tentative="1">
+      <w:start w:val="1"/>
+      <w:numFmt w:val="bullet"/>
+      <w:lvlText w:val="o"/>
+      <w:lvlJc w:val="left"/>
+      <w:pPr>
+        <w:ind w:left="6120" w:hanging="360"/>
+      </w:pPr>
+      <w:rPr>
+        <w:rFonts w:ascii="Courier New" w:hAnsi="Courier New" w:cs="Courier New" w:hint="default"/>
+      </w:rPr>
+    </w:lvl>
+    <w:lvl w:ilvl="8" w:tplc="04090005" w:tentative="1">
+      <w:start w:val="1"/>
+      <w:numFmt w:val="bullet"/>
+      <w:lvlText w:val=""/>
+      <w:lvlJc w:val="left"/>
+      <w:pPr>
+        <w:ind w:left="6840" w:hanging="360"/>
+      </w:pPr>
+      <w:rPr>
+        <w:rFonts w:ascii="Wingdings" w:hAnsi="Wingdings" w:hint="default"/>
+      </w:rPr>
+    </w:lvl>
+  </w:abstractNum>
+  <w:abstractNum w:abstractNumId="3" w15:restartNumberingAfterBreak="0">
+    <w:nsid w:val="66BC155C"/>
+    <w:multiLevelType w:val="hybridMultilevel"/>
+    <w:tmpl w:val="2F925316"/>
+    <w:lvl w:ilvl="0" w:tplc="04090001">
+      <w:start w:val="1"/>
+      <w:numFmt w:val="bullet"/>
+      <w:lvlText w:val=""/>
+      <w:lvlJc w:val="left"/>
+      <w:pPr>
+        <w:ind w:left="1080" w:hanging="360"/>
+      </w:pPr>
+      <w:rPr>
+        <w:rFonts w:ascii="Symbol" w:hAnsi="Symbol" w:hint="default"/>
+      </w:rPr>
+    </w:lvl>
+    <w:lvl w:ilvl="1" w:tplc="04090003" w:tentative="1">
+      <w:start w:val="1"/>
+      <w:numFmt w:val="bullet"/>
+      <w:lvlText w:val="o"/>
+      <w:lvlJc w:val="left"/>
+      <w:pPr>
+        <w:ind w:left="1800" w:hanging="360"/>
+      </w:pPr>
+      <w:rPr>
+        <w:rFonts w:ascii="Courier New" w:hAnsi="Courier New" w:cs="Courier New" w:hint="default"/>
+      </w:rPr>
+    </w:lvl>
+    <w:lvl w:ilvl="2" w:tplc="04090005" w:tentative="1">
+      <w:start w:val="1"/>
+      <w:numFmt w:val="bullet"/>
+      <w:lvlText w:val=""/>
+      <w:lvlJc w:val="left"/>
+      <w:pPr>
+        <w:ind w:left="2520" w:hanging="360"/>
+      </w:pPr>
+      <w:rPr>
+        <w:rFonts w:ascii="Wingdings" w:hAnsi="Wingdings" w:hint="default"/>
+      </w:rPr>
+    </w:lvl>
+    <w:lvl w:ilvl="3" w:tplc="04090001" w:tentative="1">
+      <w:start w:val="1"/>
+      <w:numFmt w:val="bullet"/>
+      <w:lvlText w:val=""/>
+      <w:lvlJc w:val="left"/>
+      <w:pPr>
+        <w:ind w:left="3240" w:hanging="360"/>
+      </w:pPr>
+      <w:rPr>
+        <w:rFonts w:ascii="Symbol" w:hAnsi="Symbol" w:hint="default"/>
+      </w:rPr>
+    </w:lvl>
+    <w:lvl w:ilvl="4" w:tplc="04090003" w:tentative="1">
+      <w:start w:val="1"/>
+      <w:numFmt w:val="bullet"/>
+      <w:lvlText w:val="o"/>
+      <w:lvlJc w:val="left"/>
+      <w:pPr>
+        <w:ind w:left="3960" w:hanging="360"/>
+      </w:pPr>
+      <w:rPr>
+        <w:rFonts w:ascii="Courier New" w:hAnsi="Courier New" w:cs="Courier New" w:hint="default"/>
+      </w:rPr>
+    </w:lvl>
+    <w:lvl w:ilvl="5" w:tplc="04090005" w:tentative="1">
+      <w:start w:val="1"/>
+      <w:numFmt w:val="bullet"/>
+      <w:lvlText w:val=""/>
+      <w:lvlJc w:val="left"/>
+      <w:pPr>
+        <w:ind w:left="4680" w:hanging="360"/>
+      </w:pPr>
+      <w:rPr>
+        <w:rFonts w:ascii="Wingdings" w:hAnsi="Wingdings" w:hint="default"/>
+      </w:rPr>
+    </w:lvl>
+    <w:lvl w:ilvl="6" w:tplc="04090001" w:tentative="1">
+      <w:start w:val="1"/>
+      <w:numFmt w:val="bullet"/>
+      <w:lvlText w:val=""/>
+      <w:lvlJc w:val="left"/>
+      <w:pPr>
+        <w:ind w:left="5400" w:hanging="360"/>
+      </w:pPr>
+      <w:rPr>
+        <w:rFonts w:ascii="Symbol" w:hAnsi="Symbol" w:hint="default"/>
+      </w:rPr>
+    </w:lvl>
+    <w:lvl w:ilvl="7" w:tplc="04090003" w:tentative="1">
+      <w:start w:val="1"/>
+      <w:numFmt w:val="bullet"/>
+      <w:lvlText w:val="o"/>
+      <w:lvlJc w:val="left"/>
+      <w:pPr>
+        <w:ind w:left="6120" w:hanging="360"/>
+      </w:pPr>
+      <w:rPr>
+        <w:rFonts w:ascii="Courier New" w:hAnsi="Courier New" w:cs="Courier New" w:hint="default"/>
+      </w:rPr>
+    </w:lvl>
+    <w:lvl w:ilvl="8" w:tplc="04090005" w:tentative="1">
+      <w:start w:val="1"/>
+      <w:numFmt w:val="bullet"/>
+      <w:lvlText w:val=""/>
+      <w:lvlJc w:val="left"/>
+      <w:pPr>
+        <w:ind w:left="6840" w:hanging="360"/>
+      </w:pPr>
+      <w:rPr>
+        <w:rFonts w:ascii="Wingdings" w:hAnsi="Wingdings" w:hint="default"/>
+      </w:rPr>
+    </w:lvl>
+  </w:abstractNum>
+  <w:abstractNum w:abstractNumId="4" w15:restartNumberingAfterBreak="0">
+    <w:nsid w:val="6B0746D5"/>
+    <w:multiLevelType w:val="hybridMultilevel"/>
+    <w:tmpl w:val="1DE07AE2"/>
+    <w:lvl w:ilvl="0" w:tplc="04090001">
+      <w:start w:val="1"/>
+      <w:numFmt w:val="bullet"/>
+      <w:lvlText w:val=""/>
+      <w:lvlJc w:val="left"/>
+      <w:pPr>
+        <w:ind w:left="1080" w:hanging="360"/>
+      </w:pPr>
+      <w:rPr>
+        <w:rFonts w:ascii="Symbol" w:hAnsi="Symbol" w:hint="default"/>
+      </w:rPr>
+    </w:lvl>
+    <w:lvl w:ilvl="1" w:tplc="04090003" w:tentative="1">
+      <w:start w:val="1"/>
+      <w:numFmt w:val="bullet"/>
+      <w:lvlText w:val="o"/>
+      <w:lvlJc w:val="left"/>
+      <w:pPr>
+        <w:ind w:left="1800" w:hanging="360"/>
+      </w:pPr>
+      <w:rPr>
+        <w:rFonts w:ascii="Courier New" w:hAnsi="Courier New" w:cs="Courier New" w:hint="default"/>
+      </w:rPr>
+    </w:lvl>
+    <w:lvl w:ilvl="2" w:tplc="04090005" w:tentative="1">
+      <w:start w:val="1"/>
+      <w:numFmt w:val="bullet"/>
+      <w:lvlText w:val=""/>
+      <w:lvlJc w:val="left"/>
+      <w:pPr>
+        <w:ind w:left="2520" w:hanging="360"/>
+      </w:pPr>
+      <w:rPr>
+        <w:rFonts w:ascii="Wingdings" w:hAnsi="Wingdings" w:hint="default"/>
+      </w:rPr>
+    </w:lvl>
+    <w:lvl w:ilvl="3" w:tplc="04090001" w:tentative="1">
+      <w:start w:val="1"/>
+      <w:numFmt w:val="bullet"/>
+      <w:lvlText w:val=""/>
+      <w:lvlJc w:val="left"/>
+      <w:pPr>
+        <w:ind w:left="3240" w:hanging="360"/>
+      </w:pPr>
+      <w:rPr>
+        <w:rFonts w:ascii="Symbol" w:hAnsi="Symbol" w:hint="default"/>
+      </w:rPr>
+    </w:lvl>
+    <w:lvl w:ilvl="4" w:tplc="04090003" w:tentative="1">
+      <w:start w:val="1"/>
+      <w:numFmt w:val="bullet"/>
+      <w:lvlText w:val="o"/>
+      <w:lvlJc w:val="left"/>
+      <w:pPr>
+        <w:ind w:left="3960" w:hanging="360"/>
+      </w:pPr>
+      <w:rPr>
+        <w:rFonts w:ascii="Courier New" w:hAnsi="Courier New" w:cs="Courier New" w:hint="default"/>
+      </w:rPr>
+    </w:lvl>
+    <w:lvl w:ilvl="5" w:tplc="04090005" w:tentative="1">
+      <w:start w:val="1"/>
+      <w:numFmt w:val="bullet"/>
+      <w:lvlText w:val=""/>
+      <w:lvlJc w:val="left"/>
+      <w:pPr>
+        <w:ind w:left="4680" w:hanging="360"/>
+      </w:pPr>
+      <w:rPr>
+        <w:rFonts w:ascii="Wingdings" w:hAnsi="Wingdings" w:hint="default"/>
+      </w:rPr>
+    </w:lvl>
+    <w:lvl w:ilvl="6" w:tplc="04090001" w:tentative="1">
+      <w:start w:val="1"/>
+      <w:numFmt w:val="bullet"/>
+      <w:lvlText w:val=""/>
+      <w:lvlJc w:val="left"/>
+      <w:pPr>
+        <w:ind w:left="5400" w:hanging="360"/>
+      </w:pPr>
+      <w:rPr>
+        <w:rFonts w:ascii="Symbol" w:hAnsi="Symbol" w:hint="default"/>
+      </w:rPr>
+    </w:lvl>
+    <w:lvl w:ilvl="7" w:tplc="04090003" w:tentative="1">
+      <w:start w:val="1"/>
+      <w:numFmt w:val="bullet"/>
+      <w:lvlText w:val="o"/>
+      <w:lvlJc w:val="left"/>
+      <w:pPr>
+        <w:ind w:left="6120" w:hanging="360"/>
+      </w:pPr>
+      <w:rPr>
+        <w:rFonts w:ascii="Courier New" w:hAnsi="Courier New" w:cs="Courier New" w:hint="default"/>
+      </w:rPr>
+    </w:lvl>
+    <w:lvl w:ilvl="8" w:tplc="04090005" w:tentative="1">
+      <w:start w:val="1"/>
+      <w:numFmt w:val="bullet"/>
+      <w:lvlText w:val=""/>
+      <w:lvlJc w:val="left"/>
+      <w:pPr>
+        <w:ind w:left="6840" w:hanging="360"/>
+      </w:pPr>
+      <w:rPr>
+        <w:rFonts w:ascii="Wingdings" w:hAnsi="Wingdings" w:hint="default"/>
+      </w:rPr>
+    </w:lvl>
+  </w:abstractNum>
   <w:num w:numId="1" w16cid:durableId="2133013814">
+    <w:abstractNumId w:val="1"/>
+  </w:num>
+  <w:num w:numId="2" w16cid:durableId="1127966455">
+    <w:abstractNumId w:val="3"/>
+  </w:num>
+  <w:num w:numId="3" w16cid:durableId="1365787314">
     <w:abstractNumId w:val="0"/>
+  </w:num>
+  <w:num w:numId="4" w16cid:durableId="960720999">
+    <w:abstractNumId w:val="2"/>
+  </w:num>
+  <w:num w:numId="5" w16cid:durableId="1844127732">
+    <w:abstractNumId w:val="4"/>
   </w:num>
 </w:numbering>
 </file>

</xml_diff>